<commit_message>
Fuel price update 2026-09-17 — Trentino-Alto Adige spotlight (refresh)
Co-Authored-By: Claude Sonnet 5 <noreply@anthropic.com>
</commit_message>
<xml_diff>
--- a/slides/article-2026-09-17.docx
+++ b/slides/article-2026-09-17.docx
@@ -31,7 +31,7 @@
           <w:sz w:val="60"/>
           <w:szCs w:val="60"/>
         </w:rPr>
-        <w:t xml:space="preserve">Trentino-Alto Adige's Methane Premium Over the Rest of Italy Is Quietly Collapsing</w:t>
+        <w:t xml:space="preserve">Trentino-Alto Adige's Metano Premium Is Shrinking — Even as GPL Pulls Further Ahead of the Rest of Italy</w:t>
       </w:r>
     </w:p>
     <w:p>
@@ -49,7 +49,7 @@
           <w:sz w:val="24"/>
           <w:szCs w:val="24"/>
         </w:rPr>
-        <w:t xml:space="preserve">On September 15, the region's petrol, diesel and LPG kept climbing in line with the rest of the country, but its once-outsized methane premium has shrunk by more than a third in nine weeks.</w:t>
+        <w:t xml:space="preserve">A week-by-week look at how the region's four fuel prices are diverging from the national average as autumn sets in.</w:t>
       </w:r>
     </w:p>
     <w:tbl>
@@ -109,7 +109,7 @@
                 <w:sz w:val="28"/>
                 <w:szCs w:val="28"/>
               </w:rPr>
-              <w:t xml:space="preserve">€2.174</w:t>
+              <w:t xml:space="preserve">€2.187</w:t>
             </w:r>
           </w:p>
           <w:p>
@@ -165,7 +165,7 @@
                 <w:sz w:val="28"/>
                 <w:szCs w:val="28"/>
               </w:rPr>
-              <w:t xml:space="preserve">€2.293</w:t>
+              <w:t xml:space="preserve">€2.307</w:t>
             </w:r>
           </w:p>
           <w:p>
@@ -221,7 +221,7 @@
                 <w:sz w:val="28"/>
                 <w:szCs w:val="28"/>
               </w:rPr>
-              <w:t xml:space="preserve">€0.800</w:t>
+              <w:t xml:space="preserve">€0.802</w:t>
             </w:r>
           </w:p>
           <w:p>
@@ -330,7 +330,7 @@
           <w:sz w:val="18"/>
           <w:szCs w:val="18"/>
         </w:rPr>
-        <w:t xml:space="preserve">Registered stations: 392 · Reporting today: 371 (95%) · Sep 15</w:t>
+        <w:t xml:space="preserve">Registered stations: 392 · Reporting today: 372 (95%) · Sep 16</w:t>
       </w:r>
     </w:p>
     <w:p>
@@ -385,7 +385,7 @@
           <w:sz w:val="22"/>
           <w:szCs w:val="22"/>
         </w:rPr>
-        <w:t xml:space="preserve">Trentino-Alto Adige's latest self-service prices, as of September 15, were Benzina at €2.174/L (up 0.52% on the day), Gasolio at €2.2928/L (up 0.63%), GPL at €0.8004/L (down 0.50%), and Metano at €1.966/L (unchanged). All four sit above the national same-day average — Benzina by 2.01%, Gasolio by 1.52%, GPL by 6.13%, and Metano by a striking 12.32% — a region where filling up costs more across the board, methane most of all.</w:t>
+        <w:t xml:space="preserve">On September 16, drivers in Trentino-Alto Adige paid €2.1872/L for self-service Benzina (up €0.0132, +0.61% day-over-day) and €2.3068/L for Gasolio (up €0.0140, +0.61%), against national self-service averages of €2.1435 and €2.2728 respectively — the region running about 2.0% above the national Benzina price and 1.5% above Gasolio. GPL held nearly flat at €0.8024/kg (+0.25% on the day) and Metano didn't move at all from the day before, staying at €1.9660/kg, but both trade well above the national floor: GPL 6.2% above the national average and Metano fully 11.7% above it. Of the region's 392 registered stations, 372 reported prices today (94.9%), comfortably ahead of the 90.2% national reporting rate.</w:t>
       </w:r>
     </w:p>
     <w:p>
@@ -403,7 +403,7 @@
           <w:sz w:val="22"/>
           <w:szCs w:val="22"/>
         </w:rPr>
-        <w:t xml:space="preserve">But the weekly data tells a more interesting story than the daily snapshot. Zooming out over the nine tracked weeks (W30 to W38, July 20 through September 15), Trentino-Alto Adige's methane price rose 6.60% while the national methane average rose nearly twice as fast at 13.44% — meaning the region's methane premium over the rest of Italy has narrowed from about 19.96% in W30 to 12.72% by W37, a real and continuing convergence. GPL is moving the opposite way: the region's LPG premium over the national average widened from 4.22% to 6.54% over the same span, even though GPL is the cheapest fuel in absolute terms. Petrol and diesel, by contrast, have tracked the national trend closely all along, rising 5.62% and roughly 2% respectively, in step with the rest of the country.</w:t>
+        <w:t xml:space="preserve">Zooming out to the nine weeks of data tracked since the week of July 20, the more interesting story is how each fuel's regional premium over the national average is moving, not just how big it is today. Metano's regional premium — long the region's most extreme outlier — has actually narrowed by about 27%, from a near-30-cent gap in late July to roughly 22 cents now, because the national Metano price has climbed faster (+16.5%) than Trentino-Alto Adige's own Metano price (+9.3%). GPL is moving the opposite way: its regional premium has widened by roughly 49% over the same stretch, as the region's GPL price crept up 1.4% while the national average essentially stood still (-0.6%). Benzina and Gasolio, meanwhile, have tracked the national trend almost lockstep — both up roughly 4-8% regionally and nationally with no meaningful shift in the premium either way.</w:t>
       </w:r>
     </w:p>
     <w:p>
@@ -422,7 +422,7 @@
           <w:sz w:val="30"/>
           <w:szCs w:val="30"/>
         </w:rPr>
-        <w:t xml:space="preserve">Trentino-Alto Adige's methane premium over the rest of Italy has shrunk from nearly a fifth to just over a tenth in nine weeks — even as prices keep climbing on both sides.</w:t>
+        <w:t xml:space="preserve">Trentino-Alto Adige's Metano premium over the national average has narrowed by roughly 27% since July — even as its GPL premium widened by about 49% over the same stretch.</w:t>
       </w:r>
     </w:p>
     <w:p>
@@ -459,7 +459,7 @@
           <w:sz w:val="34"/>
           <w:szCs w:val="34"/>
         </w:rPr>
-        <w:t xml:space="preserve">Petrol Keeps Climbing, Right on the National Pace</w:t>
+        <w:t xml:space="preserve">Benzina: Tracking the National Curve, Not Breaking From It</w:t>
       </w:r>
     </w:p>
     <w:tbl>
@@ -519,7 +519,7 @@
                 <w:sz w:val="28"/>
                 <w:szCs w:val="28"/>
               </w:rPr>
-              <w:t xml:space="preserve">€2.174</w:t>
+              <w:t xml:space="preserve">€2.187</w:t>
             </w:r>
           </w:p>
           <w:p>
@@ -533,7 +533,7 @@
                 <w:sz w:val="17"/>
                 <w:szCs w:val="17"/>
               </w:rPr>
-              <w:t xml:space="preserve">Sep 15</w:t>
+              <w:t xml:space="preserve">Sep 16</w:t>
             </w:r>
           </w:p>
         </w:tc>
@@ -575,7 +575,7 @@
                 <w:sz w:val="28"/>
                 <w:szCs w:val="28"/>
               </w:rPr>
-              <w:t xml:space="preserve">↑ +0.011 €/L</w:t>
+              <w:t xml:space="preserve">↑ +0.013 €/L</w:t>
             </w:r>
           </w:p>
           <w:p>
@@ -631,7 +631,7 @@
                 <w:sz w:val="28"/>
                 <w:szCs w:val="28"/>
               </w:rPr>
-              <w:t xml:space="preserve">+7.3%</w:t>
+              <w:t xml:space="preserve">+7.6%</w:t>
             </w:r>
           </w:p>
           <w:p>
@@ -687,7 +687,7 @@
                 <w:sz w:val="28"/>
                 <w:szCs w:val="28"/>
               </w:rPr>
-              <w:t xml:space="preserve">+7.5%</w:t>
+              <w:t xml:space="preserve">+7.9%</w:t>
             </w:r>
           </w:p>
           <w:p>
@@ -740,7 +740,7 @@
           <w:sz w:val="22"/>
           <w:szCs w:val="22"/>
         </w:rPr>
-        <w:t xml:space="preserve">Self-service Benzina in Trentino-Alto Adige closed at €2.174/L on September 15, up 0.52% from €2.1628/L the day before. That puts the region 2.01% above the national self-service average of €2.1312/L on the same day — a modest, consistent premium rather than a widening gap.</w:t>
+        <w:t xml:space="preserve">Self-service Benzina in Trentino-Alto Adige closed September 16 at €2.1872/L, up €0.0132 (+0.61%) from the previous day — a move roughly in line with the steady national climb this month. That puts the region 2.0% above the €2.1435 national self-service average, a premium that has held remarkably steady since midsummer.</w:t>
       </w:r>
     </w:p>
     <w:p>
@@ -758,7 +758,7 @@
           <w:sz w:val="22"/>
           <w:szCs w:val="22"/>
         </w:rPr>
-        <w:t xml:space="preserve">Over the nine weeks tracked (W30 through W38), regional Benzina rose from a weekly average of €2.0210/L to €2.1345/L by W37 — a 5.62% increase — while the national average rose 5.80% over the same stretch, from €1.9756/L to €2.0902/L. The two lines have moved almost in lockstep: the region's premium over the national average was 2.30% back in W30 and sits at roughly 2.06% by W37, essentially flat. The freshest two days of data (W38) show both continuing to climb, with the region at €2.1684/L — petrol is simply riding the same national upswing as everywhere else.</w:t>
+        <w:t xml:space="preserve">Across the nine tracked weeks — from the week of July 20 (€2.0210) to the week of September 14 (€2.1747) — regional Benzina is up 7.61%. Nationally, the same period saw self-service Benzina rise from €1.9756 to €2.1309, a 7.86% increase, very slightly ahead of the region. The regional premium over the national average has therefore barely budged, from about 4.5 cents in late July to about 4.4 cents now: Trentino-Alto Adige's Benzina prices aren't diverging from the rest of Italy, they're rising in step with it.</w:t>
       </w:r>
     </w:p>
     <w:p>
@@ -1428,23 +1428,23 @@
                 <w:sz w:val="18"/>
                 <w:szCs w:val="18"/>
               </w:rPr>
-              <w:t xml:space="preserve">€2.168</w:t>
-            </w:r>
-          </w:p>
-        </w:tc>
-        <w:tc>
-          <w:tcPr>
-            <w:tcW w:type="dxa" w:w="2400"/>
-          </w:tcPr>
-          <w:p>
-            <w:r>
-              <w:rPr>
-                <w:rFonts w:ascii="Calibri" w:cs="Calibri" w:eastAsia="Calibri" w:hAnsi="Calibri"/>
-                <w:color w:val="14120F"/>
-                <w:sz w:val="18"/>
-                <w:szCs w:val="18"/>
-              </w:rPr>
-              <w:t xml:space="preserve">€2.125</w:t>
+              <w:t xml:space="preserve">€2.175</w:t>
+            </w:r>
+          </w:p>
+        </w:tc>
+        <w:tc>
+          <w:tcPr>
+            <w:tcW w:type="dxa" w:w="2400"/>
+          </w:tcPr>
+          <w:p>
+            <w:r>
+              <w:rPr>
+                <w:rFonts w:ascii="Calibri" w:cs="Calibri" w:eastAsia="Calibri" w:hAnsi="Calibri"/>
+                <w:color w:val="14120F"/>
+                <w:sz w:val="18"/>
+                <w:szCs w:val="18"/>
+              </w:rPr>
+              <w:t xml:space="preserve">€2.131</w:t>
             </w:r>
           </w:p>
         </w:tc>
@@ -1500,7 +1500,7 @@
           <w:sz w:val="34"/>
           <w:szCs w:val="34"/>
         </w:rPr>
-        <w:t xml:space="preserve">Diesel's Summer Dip Is Long Gone</w:t>
+        <w:t xml:space="preserve">Gasolio Keeps Pace With the Nationwide Climb Too</w:t>
       </w:r>
     </w:p>
     <w:tbl>
@@ -1560,7 +1560,7 @@
                 <w:sz w:val="28"/>
                 <w:szCs w:val="28"/>
               </w:rPr>
-              <w:t xml:space="preserve">€2.293</w:t>
+              <w:t xml:space="preserve">€2.307</w:t>
             </w:r>
           </w:p>
           <w:p>
@@ -1574,7 +1574,7 @@
                 <w:sz w:val="17"/>
                 <w:szCs w:val="17"/>
               </w:rPr>
-              <w:t xml:space="preserve">Sep 15</w:t>
+              <w:t xml:space="preserve">Sep 16</w:t>
             </w:r>
           </w:p>
         </w:tc>
@@ -1672,7 +1672,7 @@
                 <w:sz w:val="28"/>
                 <w:szCs w:val="28"/>
               </w:rPr>
-              <w:t xml:space="preserve">+3.6%</w:t>
+              <w:t xml:space="preserve">+3.9%</w:t>
             </w:r>
           </w:p>
           <w:p>
@@ -1728,7 +1728,7 @@
                 <w:sz w:val="28"/>
                 <w:szCs w:val="28"/>
               </w:rPr>
-              <w:t xml:space="preserve">+3.5%</w:t>
+              <w:t xml:space="preserve">+3.9%</w:t>
             </w:r>
           </w:p>
           <w:p>
@@ -1781,7 +1781,7 @@
           <w:sz w:val="22"/>
           <w:szCs w:val="22"/>
         </w:rPr>
-        <w:t xml:space="preserve">Diesel in the region reached €2.2928/L self-service on September 15, up 0.63% day-over-day from €2.2784/L, and 1.52% above the national same-day average of €2.2584/L.</w:t>
+        <w:t xml:space="preserve">Gasolio (self-service) in the region reached €2.3068/L on September 16, up €0.0140 (+0.61%) day-over-day — matching Benzina's daily move almost to the decimal. That's 1.5% above the €2.2728 national self-service average, one of the smaller regional premiums among the four fuels tracked here.</w:t>
       </w:r>
     </w:p>
     <w:p>
@@ -1799,7 +1799,7 @@
           <w:sz w:val="22"/>
           <w:szCs w:val="22"/>
         </w:rPr>
-        <w:t xml:space="preserve">The multi-week arc is more interesting than the daily number: regional Gasolio actually fell from €2.2063/L in W30 to a low of €2.1493/L in W33 (a 2.58% dip through early August), before reversing hard and climbing 4.70% from that low to €2.2503/L by W37 — a net gain of 1.99% over the full nine weeks. Nationally the pattern was nearly identical, down then up, for a net 1.89% rise from €2.1747/L to €2.2158/L. The regional premium over the national average has stayed narrow and stable throughout, around 1.45%–1.52%, meaning diesel here isn't diverging from the rest of Italy — it's just riding the same late-summer rebound a beat behind.</w:t>
+        <w:t xml:space="preserve">Over the nine-week window from the week of July 20 (€2.2063) to the week of September 14 (€2.2927), regional Gasolio rose 3.92%, essentially matching the national move from €2.1747 to €2.2585 (+3.85%). The premium gap has widened only marginally, from about 3.2 cents to about 3.4 cents — Gasolio, like Benzina, is a fuel where Trentino-Alto Adige is simply riding the same wave as the rest of the country, not setting its own course.</w:t>
       </w:r>
     </w:p>
     <w:p>
@@ -2469,23 +2469,23 @@
                 <w:sz w:val="18"/>
                 <w:szCs w:val="18"/>
               </w:rPr>
-              <w:t xml:space="preserve">€2.286</w:t>
-            </w:r>
-          </w:p>
-        </w:tc>
-        <w:tc>
-          <w:tcPr>
-            <w:tcW w:type="dxa" w:w="2400"/>
-          </w:tcPr>
-          <w:p>
-            <w:r>
-              <w:rPr>
-                <w:rFonts w:ascii="Calibri" w:cs="Calibri" w:eastAsia="Calibri" w:hAnsi="Calibri"/>
-                <w:color w:val="14120F"/>
-                <w:sz w:val="18"/>
-                <w:szCs w:val="18"/>
-              </w:rPr>
-              <w:t xml:space="preserve">€2.251</w:t>
+              <w:t xml:space="preserve">€2.293</w:t>
+            </w:r>
+          </w:p>
+        </w:tc>
+        <w:tc>
+          <w:tcPr>
+            <w:tcW w:type="dxa" w:w="2400"/>
+          </w:tcPr>
+          <w:p>
+            <w:r>
+              <w:rPr>
+                <w:rFonts w:ascii="Calibri" w:cs="Calibri" w:eastAsia="Calibri" w:hAnsi="Calibri"/>
+                <w:color w:val="14120F"/>
+                <w:sz w:val="18"/>
+                <w:szCs w:val="18"/>
+              </w:rPr>
+              <w:t xml:space="preserve">€2.259</w:t>
             </w:r>
           </w:p>
         </w:tc>
@@ -2541,7 +2541,7 @@
           <w:sz w:val="34"/>
           <w:szCs w:val="34"/>
         </w:rPr>
-        <w:t xml:space="preserve">LPG Is the One Fuel Pulling Away From the Rest of Italy</w:t>
+        <w:t xml:space="preserve">GPL: The Region's Premium Over Italy Is Quietly Widening</w:t>
       </w:r>
     </w:p>
     <w:tbl>
@@ -2601,7 +2601,7 @@
                 <w:sz w:val="28"/>
                 <w:szCs w:val="28"/>
               </w:rPr>
-              <w:t xml:space="preserve">€0.800</w:t>
+              <w:t xml:space="preserve">€0.802</w:t>
             </w:r>
           </w:p>
           <w:p>
@@ -2615,7 +2615,7 @@
                 <w:sz w:val="17"/>
                 <w:szCs w:val="17"/>
               </w:rPr>
-              <w:t xml:space="preserve">Sep 15</w:t>
+              <w:t xml:space="preserve">Sep 16</w:t>
             </w:r>
           </w:p>
         </w:tc>
@@ -2657,7 +2657,7 @@
                 <w:sz w:val="28"/>
                 <w:szCs w:val="28"/>
               </w:rPr>
-              <w:t xml:space="preserve">↓ -0.004 €/L</w:t>
+              <w:t xml:space="preserve">↑ +0.002 €/L</w:t>
             </w:r>
           </w:p>
           <w:p>
@@ -2822,7 +2822,7 @@
           <w:sz w:val="22"/>
           <w:szCs w:val="22"/>
         </w:rPr>
-        <w:t xml:space="preserve">GPL was the only fuel to fall in the region on September 15, down 0.50% to €0.8004/L self-service from €0.8044/L the previous day. Even so, it remains the fuel with the widest regional markup: 6.13% above the national same-day average of €0.7542/L.</w:t>
+        <w:t xml:space="preserve">GPL held at €0.8024/kg on September 16, up just €0.0020 (+0.25%) on the day — the smallest daily move of the four fuels. But it carries the second-largest regional premium of the group: 6.2% above the €0.7554 national self-service average.</w:t>
       </w:r>
     </w:p>
     <w:p>
@@ -2840,7 +2840,7 @@
           <w:sz w:val="22"/>
           <w:szCs w:val="22"/>
         </w:rPr>
-        <w:t xml:space="preserve">That gap has been widening, not shrinking. Regional GPL climbed 1.67% over the nine tracked weeks, from €0.7912/L in W30 to €0.8044/L in W37, while the national average actually slipped 0.55%, from €0.7592/L to €0.7550/L, over the same period. The result: the region's LPG premium over the rest of Italy grew from 4.22% in W30 to 6.54% by W37 — the one clear case this quarter of a regional fuel market decoupling from the national trend, moving up as the rest of the country holds flat or edges down.</w:t>
+        <w:t xml:space="preserve">The multi-week trend is what makes GPL notable. From the week of July 20 (€0.7912) to the week of September 14 (€0.8024), the regional price rose 1.42%, while the national average actually fell slightly, from €0.7592 to €0.7547 (-0.59%). That divergence means the region's GPL premium over the national average has widened by roughly 49% in under two months — from about a 3.2-cent gap to about a 4.8-cent gap. Of the four fuels tracked, GPL is the one where Trentino-Alto Adige is most visibly pulling away from the national trend.</w:t>
       </w:r>
     </w:p>
     <w:p>
@@ -3526,7 +3526,7 @@
                 <w:sz w:val="18"/>
                 <w:szCs w:val="18"/>
               </w:rPr>
-              <w:t xml:space="preserve">€0.754</w:t>
+              <w:t xml:space="preserve">€0.755</w:t>
             </w:r>
           </w:p>
         </w:tc>
@@ -3582,7 +3582,7 @@
           <w:sz w:val="34"/>
           <w:szCs w:val="34"/>
         </w:rPr>
-        <w:t xml:space="preserve">Methane's Regional Premium Is Closing Fast</w:t>
+        <w:t xml:space="preserve">Metano's Enormous Regional Premium Is Actually Shrinking</w:t>
       </w:r>
     </w:p>
     <w:tbl>
@@ -3656,7 +3656,7 @@
                 <w:sz w:val="17"/>
                 <w:szCs w:val="17"/>
               </w:rPr>
-              <w:t xml:space="preserve">Sep 15</w:t>
+              <w:t xml:space="preserve">Sep 16</w:t>
             </w:r>
           </w:p>
         </w:tc>
@@ -3810,7 +3810,7 @@
                 <w:sz w:val="28"/>
                 <w:szCs w:val="28"/>
               </w:rPr>
-              <w:t xml:space="preserve">+16.1%</w:t>
+              <w:t xml:space="preserve">+16.5%</w:t>
             </w:r>
           </w:p>
           <w:p>
@@ -3863,7 +3863,7 @@
           <w:sz w:val="22"/>
           <w:szCs w:val="22"/>
         </w:rPr>
-        <w:t xml:space="preserve">Methane held flat in the region on September 15 at €1.966/L self-service, unchanged from the previous day, but it carries by far the largest gap to the national picture: 12.32% above the national same-day average of €1.7503/L. Trentino-Alto Adige remains one of the more expensive places in Italy to fill up on Metano in absolute terms.</w:t>
+        <w:t xml:space="preserve">Metano was flat at €1.9660/kg on September 16 — no change from the prior day — but it carries by far the largest regional premium of any fuel: 11.7% above the €1.7608 national self-service average, a gap of just over 20 cents.</w:t>
       </w:r>
     </w:p>
     <w:p>
@@ -3881,7 +3881,7 @@
           <w:sz w:val="22"/>
           <w:szCs w:val="22"/>
         </w:rPr>
-        <w:t xml:space="preserve">The real story is how fast that gap is closing. Regional methane rose 6.60% over the nine tracked weeks, from €1.7993/L in W30 to €1.9180/L by W37, while the national average rose almost twice as fast, 13.44%, climbing from €1.4999/L to €1.7015/L over the same stretch. That asymmetry means the region's methane premium over the rest of Italy shrank from about 19.96% in W30 to roughly 12.72% by W37 — a reduction of more than a third in the size of the premium in just over two months. If the national price keeps closing the distance at this pace, Trentino-Alto Adige's long-standing methane surcharge could all but disappear within the next couple of months.</w:t>
+        <w:t xml:space="preserve">That's still a striking gap, but the more interesting trend is the direction it's moving. From the week of July 20 (€1.7993) to the week of September 14 (€1.9660), regional Metano rose 9.26%. Nationally, though, Metano climbed much faster — from €1.4999 to €1.7477, a 16.51% jump, nearly double the regional rate of increase. The result: the region's Metano premium over the national average has actually narrowed by about 27%, from a near-30-cent gap in late July to roughly 22 cents now. Trentino-Alto Adige still pays a steep premium for Metano, but the rest of Italy is closing the gap faster than the region is pulling away.</w:t>
       </w:r>
     </w:p>
     <w:p>
@@ -4567,23 +4567,23 @@
                 <w:sz w:val="18"/>
                 <w:szCs w:val="18"/>
               </w:rPr>
-              <w:t xml:space="preserve">€1.741</w:t>
-            </w:r>
-          </w:p>
-        </w:tc>
-        <w:tc>
-          <w:tcPr>
-            <w:tcW w:type="dxa" w:w="2400"/>
-          </w:tcPr>
-          <w:p>
-            <w:r>
-              <w:rPr>
-                <w:rFonts w:ascii="Calibri" w:cs="Calibri" w:eastAsia="Calibri" w:hAnsi="Calibri"/>
-                <w:color w:val="14120F"/>
-                <w:sz w:val="18"/>
-                <w:szCs w:val="18"/>
-              </w:rPr>
-              <w:t xml:space="preserve">↑ +0.225 €/L</w:t>
+              <w:t xml:space="preserve">€1.748</w:t>
+            </w:r>
+          </w:p>
+        </w:tc>
+        <w:tc>
+          <w:tcPr>
+            <w:tcW w:type="dxa" w:w="2400"/>
+          </w:tcPr>
+          <w:p>
+            <w:r>
+              <w:rPr>
+                <w:rFonts w:ascii="Calibri" w:cs="Calibri" w:eastAsia="Calibri" w:hAnsi="Calibri"/>
+                <w:color w:val="14120F"/>
+                <w:sz w:val="18"/>
+                <w:szCs w:val="18"/>
+              </w:rPr>
+              <w:t xml:space="preserve">↑ +0.218 €/L</w:t>
             </w:r>
           </w:p>
         </w:tc>
@@ -4623,7 +4623,7 @@
           <w:sz w:val="34"/>
           <w:szCs w:val="34"/>
         </w:rPr>
-        <w:t xml:space="preserve">371 of 392 Stations Reporting — Ahead of the National Average</w:t>
+        <w:t xml:space="preserve">A Reporting Rate Well Above the National Average</w:t>
       </w:r>
     </w:p>
     <w:p>
@@ -4641,7 +4641,7 @@
           <w:sz w:val="22"/>
           <w:szCs w:val="22"/>
         </w:rPr>
-        <w:t xml:space="preserve">Trentino-Alto Adige has 392 registered fuel stations, of which 371 reported prices on September 15 — a 94.64% reporting rate, essentially unchanged from 94.90% (372 of 392) the day before. Nationally, 21,646 of 24,004 registered stations reported that same day, a 90.18% rate, meaning this region's network is reporting noticeably more consistently than the country as a whole.</w:t>
+        <w:t xml:space="preserve">Trentino-Alto Adige has 392 registered fuel stations, of which 372 reported prices on September 16 — a 94.9% reporting rate. That's noticeably higher than the 90.2% rate seen across Italy's roughly 24,000 registered stations (21,645 reporting nationally today).</w:t>
       </w:r>
     </w:p>
     <w:p>
@@ -4659,7 +4659,7 @@
           <w:sz w:val="22"/>
           <w:szCs w:val="22"/>
         </w:rPr>
-        <w:t xml:space="preserve">A reporting rate above 94% means the region's daily averages are built on a near-complete picture of its station network rather than a thin, potentially unrepresentative slice of it — which matters most for a smaller regional market like this one, where a handful of missing stations could otherwise skew the average more than they would in a larger region.</w:t>
+        <w:t xml:space="preserve">A high reporting rate matters because it's what makes the region's average prices trustworthy day to day: with only a handful of stations not reporting, Trentino-Alto Adige's figures reflect close to the full local market rather than a thin, potentially unrepresentative sample. It's also a useful sanity check on the numbers in this report — a sudden drop in the reporting rate would be the first sign that a day's regional average should be read with more caution.</w:t>
       </w:r>
     </w:p>
     <w:p>
@@ -4696,7 +4696,7 @@
           <w:sz w:val="34"/>
           <w:szCs w:val="34"/>
         </w:rPr>
-        <w:t xml:space="preserve">A Report That Writes Itself, Every Day</w:t>
+        <w:t xml:space="preserve">How This Report Gets Made — Without a Spreadsheet in Sight</w:t>
       </w:r>
     </w:p>
     <w:p>
@@ -4714,7 +4714,7 @@
           <w:sz w:val="22"/>
           <w:szCs w:val="22"/>
         </w:rPr>
-        <w:t xml:space="preserve">Everything above — the daily price pull from Italy's MIMIT open-data feed, the region-of-the-day rotation, the nine-week trend analysis comparing this region against the national average, and the prose you're reading right now — is produced automatically each morning by an unattended pipeline built with Claude Code. No person picks the region, calculates the percentages, or drafts the sentences; a script selects the day's region on a fixed rotation, an analysis step computes the real week-over-week and regional-versus-national figures straight from the source data, and an AI writing step turns those figures into this report, fresh, every single day.</w:t>
+        <w:t xml:space="preserve">Everything in this report — the daily price data, the region-of-the-day rotation, the week-by-week trend analysis, and the prose itself — is produced automatically, every day, by an unattended pipeline built with Claude Code. A scheduled job pulls the day's price and station-registry data, deterministically picks a region to feature (a fixed alphabetical rotation over Italy's 20 regions, keyed to the calendar date), computes the weekly regional-vs-national comparisons, and then an AI agent reads those real numbers and writes the analysis from scratch — nothing here is a template with numbers dropped in.</w:t>
       </w:r>
     </w:p>
     <w:p>
@@ -4732,7 +4732,7 @@
           <w:sz w:val="22"/>
           <w:szCs w:val="22"/>
         </w:rPr>
-        <w:t xml:space="preserve">That's a fundamentally different model from the spreadsheet most fuel-price trackers still rely on: a manually-maintained Excel file needs someone to re-download the data, re-check the formulas, and re-write the commentary every day, which is exactly the kind of repetitive, error-prone work that tends to quietly stop happening after a few weeks. This pipeline doesn't get tired, doesn't forget a day, and doesn't introduce a copy-paste error into a formula — it just runs.</w:t>
+        <w:t xml:space="preserve">Contrast that with the traditional way this kind of tracking gets done: someone manually downloading a CSV each morning, pasting it into a spreadsheet, recalculating a handful of averages by hand, and writing up a summary if and when they get around to it. That approach doesn't scale past one or two fuels or one region, and it breaks the moment someone forgets a day. This pipeline runs the same way every single day, covers all four fuels and all 20 regions in rotation, and produces a full report plus a live dashboard update without anyone opening Excel.</w:t>
       </w:r>
     </w:p>
     <w:p>
@@ -4769,7 +4769,7 @@
           <w:sz w:val="34"/>
           <w:szCs w:val="34"/>
         </w:rPr>
-        <w:t xml:space="preserve">Nineteen Other Regions Are Waiting</w:t>
+        <w:t xml:space="preserve">Explore the Rest of Italy on the Live Dashboard</w:t>
       </w:r>
     </w:p>
     <w:p>
@@ -4787,7 +4787,7 @@
           <w:sz w:val="22"/>
           <w:szCs w:val="22"/>
         </w:rPr>
-        <w:t xml:space="preserve">Trentino-Alto Adige is today's spotlight in a rotation that cycles through all twenty of Italy's regions, and every one of them has its own version of this same story — some tracking the national trend closely, others quietly diverging the way GPL and Metano have here. The full interactive dashboard, with the complete history and every region, province, comune and fuel retailer, is live now at the Fuel Dashboard.</w:t>
+        <w:t xml:space="preserve">Trentino-Alto Adige is just today's spotlight — the Fuel Dashboard tracks all 20 Italian regions, every province, and thousands of individual comuni and stations, updated daily. Visit https://adeo-blip.github.io/fuel-price-italy/ to filter by your own region, compare fuels side by side, or see which part of Italy is paying the most (or least) right now.</w:t>
       </w:r>
     </w:p>
     <w:p>

</xml_diff>

<commit_message>
Fuel price update 2026-09-17 — Trentino-Alto Adige spotlight
Co-Authored-By: Claude Sonnet 5 <noreply@anthropic.com>
</commit_message>
<xml_diff>
--- a/slides/article-2026-09-17.docx
+++ b/slides/article-2026-09-17.docx
@@ -31,7 +31,7 @@
           <w:sz w:val="60"/>
           <w:szCs w:val="60"/>
         </w:rPr>
-        <w:t xml:space="preserve">Trentino-Alto Adige's Metano Premium Is Shrinking — Even as GPL Pulls Further Ahead of the Rest of Italy</w:t>
+        <w:t xml:space="preserve">Trentino-Alto Adige's Methane Premium Is Quietly Shrinking</w:t>
       </w:r>
     </w:p>
     <w:p>
@@ -49,7 +49,7 @@
           <w:sz w:val="24"/>
           <w:szCs w:val="24"/>
         </w:rPr>
-        <w:t xml:space="preserve">A week-by-week look at how the region's four fuel prices are diverging from the national average as autumn sets in.</w:t>
+        <w:t xml:space="preserve">Petrol and diesel keep climbing in lockstep with the national market, but the region's historically expensive natural gas is losing its edge as prices catch up everywhere else.</w:t>
       </w:r>
     </w:p>
     <w:tbl>
@@ -385,7 +385,7 @@
           <w:sz w:val="22"/>
           <w:szCs w:val="22"/>
         </w:rPr>
-        <w:t xml:space="preserve">On September 16, drivers in Trentino-Alto Adige paid €2.1872/L for self-service Benzina (up €0.0132, +0.61% day-over-day) and €2.3068/L for Gasolio (up €0.0140, +0.61%), against national self-service averages of €2.1435 and €2.2728 respectively — the region running about 2.0% above the national Benzina price and 1.5% above Gasolio. GPL held nearly flat at €0.8024/kg (+0.25% on the day) and Metano didn't move at all from the day before, staying at €1.9660/kg, but both trade well above the national floor: GPL 6.2% above the national average and Metano fully 11.7% above it. Of the region's 392 registered stations, 372 reported prices today (94.9%), comfortably ahead of the 90.2% national reporting rate.</w:t>
+        <w:t xml:space="preserve">As of September 16, drivers in Trentino-Alto Adige paid €2.1872/L for self-service Benzina, €2.3068/L for Gasolio, €0.8024/L for GPL and €1.966/L for Metano — all four fuels above the national self-service average that day, with petrol and diesel up roughly six-tenths of a cent from the day before and GPL and Metano essentially flat. Across the region's 392 registered stations, 372 reported prices, a 94.9% reporting rate that beats the national average of 90.2% and edged up by one more station than the previous day.</w:t>
       </w:r>
     </w:p>
     <w:p>
@@ -403,7 +403,7 @@
           <w:sz w:val="22"/>
           <w:szCs w:val="22"/>
         </w:rPr>
-        <w:t xml:space="preserve">Zooming out to the nine weeks of data tracked since the week of July 20, the more interesting story is how each fuel's regional premium over the national average is moving, not just how big it is today. Metano's regional premium — long the region's most extreme outlier — has actually narrowed by about 27%, from a near-30-cent gap in late July to roughly 22 cents now, because the national Metano price has climbed faster (+16.5%) than Trentino-Alto Adige's own Metano price (+9.3%). GPL is moving the opposite way: its regional premium has widened by roughly 49% over the same stretch, as the region's GPL price crept up 1.4% while the national average essentially stood still (-0.6%). Benzina and Gasolio, meanwhile, have tracked the national trend almost lockstep — both up roughly 4-8% regionally and nationally with no meaningful shift in the premium either way.</w:t>
+        <w:t xml:space="preserve">The daily numbers only tell half the story. Pulled back to the nine tracked weeks since July 20, Benzina and Gasolio in Trentino-Alto Adige have risen almost exactly in step with the national market — up 7.6% and 3.9% regionally versus 7.9% and 3.9% nationally. GPL and Metano are where the region is genuinely diverging: local LPG has crept up 1.4% while the national LPG average has actually slipped slightly, and — the standout finding this week — Trentino-Alto Adige's usually steep Metano premium over the rest of Italy has narrowed by more than a third since late July, as national methane prices surge faster than the region's own.</w:t>
       </w:r>
     </w:p>
     <w:p>
@@ -422,7 +422,7 @@
           <w:sz w:val="30"/>
           <w:szCs w:val="30"/>
         </w:rPr>
-        <w:t xml:space="preserve">Trentino-Alto Adige's Metano premium over the national average has narrowed by roughly 27% since July — even as its GPL premium widened by about 49% over the same stretch.</w:t>
+        <w:t xml:space="preserve">Trentino-Alto Adige's methane premium over the rest of Italy has narrowed from nearly 20% to about 12.5% since late July — not because local prices fell, but because the national average is catching up nearly twice as fast.</w:t>
       </w:r>
     </w:p>
     <w:p>
@@ -459,7 +459,7 @@
           <w:sz w:val="34"/>
           <w:szCs w:val="34"/>
         </w:rPr>
-        <w:t xml:space="preserve">Benzina: Tracking the National Curve, Not Breaking From It</w:t>
+        <w:t xml:space="preserve">Petrol Extends Its Nine-Week Climb, Still a Premium Pump</w:t>
       </w:r>
     </w:p>
     <w:tbl>
@@ -740,7 +740,7 @@
           <w:sz w:val="22"/>
           <w:szCs w:val="22"/>
         </w:rPr>
-        <w:t xml:space="preserve">Self-service Benzina in Trentino-Alto Adige closed September 16 at €2.1872/L, up €0.0132 (+0.61%) from the previous day — a move roughly in line with the steady national climb this month. That puts the region 2.0% above the €2.1435 national self-service average, a premium that has held remarkably steady since midsummer.</w:t>
+        <w:t xml:space="preserve">Self-service Benzina in Trentino-Alto Adige closed at €2.1872/L on September 16, up €0.0132 (+0.61%) from €2.1740/L the day before. That puts the region 2.04% above the national self-service average of €2.1435/L on the same day — a gap that has held fairly steady through the recent run-up, meaning local pumps aren't pulling further away from the rest of the country, just riding the same wave a little higher.</w:t>
       </w:r>
     </w:p>
     <w:p>
@@ -758,7 +758,7 @@
           <w:sz w:val="22"/>
           <w:szCs w:val="22"/>
         </w:rPr>
-        <w:t xml:space="preserve">Across the nine tracked weeks — from the week of July 20 (€2.0210) to the week of September 14 (€2.1747) — regional Benzina is up 7.61%. Nationally, the same period saw self-service Benzina rise from €1.9756 to €2.1309, a 7.86% increase, very slightly ahead of the region. The regional premium over the national average has therefore barely budged, from about 4.5 cents in late July to about 4.4 cents now: Trentino-Alto Adige's Benzina prices aren't diverging from the rest of Italy, they're rising in step with it.</w:t>
+        <w:t xml:space="preserve">Zooming out to the full nine-week window, regional Benzina has climbed from €2.0210/L in the week of July 20 (W30) to €2.1747/L in the week of September 14 (W38) — a 7.6% increase. Nationally, the same period saw self-service petrol rise 7.9%, from €1.9756/L to €2.1309/L. The two curves are close enough to call this a genuinely national trend rather than a regional story: petrol has been getting steadily more expensive everywhere since late summer, and Trentino-Alto Adige is simply tracking it, week for week, without much local distortion.</w:t>
       </w:r>
     </w:p>
     <w:p>
@@ -1500,7 +1500,7 @@
           <w:sz w:val="34"/>
           <w:szCs w:val="34"/>
         </w:rPr>
-        <w:t xml:space="preserve">Gasolio Keeps Pace With the Nationwide Climb Too</w:t>
+        <w:t xml:space="preserve">Diesel's Steady Summer Climb Mirrors the National Curve Almost Exactly</w:t>
       </w:r>
     </w:p>
     <w:tbl>
@@ -1781,7 +1781,7 @@
           <w:sz w:val="22"/>
           <w:szCs w:val="22"/>
         </w:rPr>
-        <w:t xml:space="preserve">Gasolio (self-service) in the region reached €2.3068/L on September 16, up €0.0140 (+0.61%) day-over-day — matching Benzina's daily move almost to the decimal. That's 1.5% above the €2.2728 national self-service average, one of the smaller regional premiums among the four fuels tracked here.</w:t>
+        <w:t xml:space="preserve">Diesel in the region reached €2.3068/L self-service on September 16, up €0.0140 (+0.61%) day-over-day from €2.2928/L, and 1.50% above the national self-service figure of €2.2728/L for the same date. Like petrol, that premium over the national average has stayed narrow and stable rather than widening — Trentino-Alto Adige diesel is expensive relative to the rest of Italy, but not becoming more so.</w:t>
       </w:r>
     </w:p>
     <w:p>
@@ -1799,7 +1799,7 @@
           <w:sz w:val="22"/>
           <w:szCs w:val="22"/>
         </w:rPr>
-        <w:t xml:space="preserve">Over the nine-week window from the week of July 20 (€2.2063) to the week of September 14 (€2.2927), regional Gasolio rose 3.92%, essentially matching the national move from €2.1747 to €2.2585 (+3.85%). The premium gap has widened only marginally, from about 3.2 cents to about 3.4 cents — Gasolio, like Benzina, is a fuel where Trentino-Alto Adige is simply riding the same wave as the rest of the country, not setting its own course.</w:t>
+        <w:t xml:space="preserve">Over the nine tracked weeks, regional Gasolio rose from €2.2063/L (W30) to €2.2927/L (W38), a 3.9% increase, against a near-identical 3.85% national rise from €2.1747/L to €2.2585/L over the same stretch. Diesel is the fuel where region and nation move most in sync this year: the weekly series barely diverges at any point between July and September, suggesting diesel pricing here is driven almost entirely by the same wholesale and refining pressures affecting the whole country, with no meaningful local premium expansion to flag.</w:t>
       </w:r>
     </w:p>
     <w:p>
@@ -2541,7 +2541,7 @@
           <w:sz w:val="34"/>
           <w:szCs w:val="34"/>
         </w:rPr>
-        <w:t xml:space="preserve">GPL: The Region's Premium Over Italy Is Quietly Widening</w:t>
+        <w:t xml:space="preserve">LPG Holds Nearly Flat Locally While the National Average Quietly Slips</w:t>
       </w:r>
     </w:p>
     <w:tbl>
@@ -2822,7 +2822,7 @@
           <w:sz w:val="22"/>
           <w:szCs w:val="22"/>
         </w:rPr>
-        <w:t xml:space="preserve">GPL held at €0.8024/kg on September 16, up just €0.0020 (+0.25%) on the day — the smallest daily move of the four fuels. But it carries the second-largest regional premium of the group: 6.2% above the €0.7554 national self-service average.</w:t>
+        <w:t xml:space="preserve">GPL edged up to €0.8024/L self-service on September 16, a modest €0.0020 (+0.25%) gain from €0.8004/L the previous day. That leaves it 6.22% above the national self-service average of €0.7554/L — proportionally the widest gap of any of the four fuels, even though LPG remains by far the cheapest option at the pump in absolute terms.</w:t>
       </w:r>
     </w:p>
     <w:p>
@@ -2840,7 +2840,7 @@
           <w:sz w:val="22"/>
           <w:szCs w:val="22"/>
         </w:rPr>
-        <w:t xml:space="preserve">The multi-week trend is what makes GPL notable. From the week of July 20 (€0.7912) to the week of September 14 (€0.8024), the regional price rose 1.42%, while the national average actually fell slightly, from €0.7592 to €0.7547 (-0.59%). That divergence means the region's GPL premium over the national average has widened by roughly 49% in under two months — from about a 3.2-cent gap to about a 4.8-cent gap. Of the four fuels tracked, GPL is the one where Trentino-Alto Adige is most visibly pulling away from the national trend.</w:t>
+        <w:t xml:space="preserve">The multi-week picture is where GPL gets interesting: regional LPG rose 1.4% over the nine weeks tracked, from €0.7912/L (W30) to €0.8024/L (W38), while the national LPG average actually fell 0.6%, from €0.7592/L to €0.7547/L, over the identical period. That's the only fuel of the four where region and nation moved in opposite directions — Trentino-Alto Adige's LPG got a little more expensive at the same time the rest of Italy's got a little cheaper, quietly widening what was already the largest proportional regional premium in the dataset.</w:t>
       </w:r>
     </w:p>
     <w:p>
@@ -3582,7 +3582,7 @@
           <w:sz w:val="34"/>
           <w:szCs w:val="34"/>
         </w:rPr>
-        <w:t xml:space="preserve">Metano's Enormous Regional Premium Is Actually Shrinking</w:t>
+        <w:t xml:space="preserve">The Region's Big Methane Premium Keeps Shrinking as the Nation Catches Up</w:t>
       </w:r>
     </w:p>
     <w:tbl>
@@ -3863,7 +3863,7 @@
           <w:sz w:val="22"/>
           <w:szCs w:val="22"/>
         </w:rPr>
-        <w:t xml:space="preserve">Metano was flat at €1.9660/kg on September 16 — no change from the prior day — but it carries by far the largest regional premium of any fuel: 11.7% above the €1.7608 national self-service average, a gap of just over 20 cents.</w:t>
+        <w:t xml:space="preserve">Self-service Metano held flat at €1.966/L on September 16, unchanged from the day before, but still 11.65% above the national self-service average of €1.7608/L — by a wide margin the largest gap of any fuel this region carries relative to the rest of Italy.</w:t>
       </w:r>
     </w:p>
     <w:p>
@@ -3881,7 +3881,7 @@
           <w:sz w:val="22"/>
           <w:szCs w:val="22"/>
         </w:rPr>
-        <w:t xml:space="preserve">That's still a striking gap, but the more interesting trend is the direction it's moving. From the week of July 20 (€1.7993) to the week of September 14 (€1.9660), regional Metano rose 9.26%. Nationally, though, Metano climbed much faster — from €1.4999 to €1.7477, a 16.51% jump, nearly double the regional rate of increase. The result: the region's Metano premium over the national average has actually narrowed by about 27%, from a near-30-cent gap in late July to roughly 22 cents now. Trentino-Alto Adige still pays a steep premium for Metano, but the rest of Italy is closing the gap faster than the region is pulling away.</w:t>
+        <w:t xml:space="preserve">That gap, though, is closing fast. In the week of July 20, Trentino-Alto Adige's average Metano price of €1.7993/L sat 19.96% above the national average of €1.4999/L. By the week of September 14, the region's price had risen to €1.966/L (+9.3% over the nine weeks) while the national average surged to €1.7477/L (+16.5% over the same span) — nearly double the region's rate of increase. The result: the regional premium has narrowed from roughly 20% to about 12.5%, a relative drop of more than a third. Metano is the fastest-moving fuel nationally this quarter by a wide margin, and Trentino-Alto Adige's historic status as an expensive outlier for natural gas is measurably eroding as the rest of the country's methane prices rush to catch up.</w:t>
       </w:r>
     </w:p>
     <w:p>
@@ -4623,7 +4623,7 @@
           <w:sz w:val="34"/>
           <w:szCs w:val="34"/>
         </w:rPr>
-        <w:t xml:space="preserve">A Reporting Rate Well Above the National Average</w:t>
+        <w:t xml:space="preserve">A High-Reporting Region: 372 of 392 Stations Checked In Today</w:t>
       </w:r>
     </w:p>
     <w:p>
@@ -4641,7 +4641,7 @@
           <w:sz w:val="22"/>
           <w:szCs w:val="22"/>
         </w:rPr>
-        <w:t xml:space="preserve">Trentino-Alto Adige has 392 registered fuel stations, of which 372 reported prices on September 16 — a 94.9% reporting rate. That's noticeably higher than the 90.2% rate seen across Italy's roughly 24,000 registered stations (21,645 reporting nationally today).</w:t>
+        <w:t xml:space="preserve">Trentino-Alto Adige has 392 registered fuel stations, of which 372 reported prices on September 16 — a 94.9% reporting rate, one station higher than the 371 that reported the day before. That compares favorably to the national reporting rate of 90.2% (21,645 of 24,000 registered stations), making this one of the more reliably-covered regions in the dataset on any given day.</w:t>
       </w:r>
     </w:p>
     <w:p>
@@ -4659,7 +4659,7 @@
           <w:sz w:val="22"/>
           <w:szCs w:val="22"/>
         </w:rPr>
-        <w:t xml:space="preserve">A high reporting rate matters because it's what makes the region's average prices trustworthy day to day: with only a handful of stations not reporting, Trentino-Alto Adige's figures reflect close to the full local market rather than a thin, potentially unrepresentative sample. It's also a useful sanity check on the numbers in this report — a sudden drop in the reporting rate would be the first sign that a day's regional average should be read with more caution.</w:t>
+        <w:t xml:space="preserve">A high and stable reporting rate matters for how much weight to put on the region's daily figures: with roughly 95% of registered stations checking in consistently, the daily and weekly averages presented here are unlikely to be skewed by a handful of stragglers dropping in and out of the sample, unlike lower-reporting regions where day-to-day swings can partly reflect which stations happened to report rather than genuine price movement.</w:t>
       </w:r>
     </w:p>
     <w:p>
@@ -4696,7 +4696,7 @@
           <w:sz w:val="34"/>
           <w:szCs w:val="34"/>
         </w:rPr>
-        <w:t xml:space="preserve">How This Report Gets Made — Without a Spreadsheet in Sight</w:t>
+        <w:t xml:space="preserve">How This Report Gets Made: No Spreadsheet, No Analyst, No Manual Step</w:t>
       </w:r>
     </w:p>
     <w:p>
@@ -4714,7 +4714,7 @@
           <w:sz w:val="22"/>
           <w:szCs w:val="22"/>
         </w:rPr>
-        <w:t xml:space="preserve">Everything in this report — the daily price data, the region-of-the-day rotation, the week-by-week trend analysis, and the prose itself — is produced automatically, every day, by an unattended pipeline built with Claude Code. A scheduled job pulls the day's price and station-registry data, deterministically picks a region to feature (a fixed alphabetical rotation over Italy's 20 regions, keyed to the calendar date), computes the weekly regional-vs-national comparisons, and then an AI agent reads those real numbers and writes the analysis from scratch — nothing here is a template with numbers dropped in.</w:t>
+        <w:t xml:space="preserve">Every part of this report — pulling the day's price and registry data, computing the weekly regional and national trend series, rotating deterministically through Italy's 20 regions by calendar date, and writing the analysis above in plain English — runs automatically, once a day, without a person opening a spreadsheet or copying a number by hand. The pipeline is built entirely with Claude Code: an AI coding agent wrote the scripts that fetch and reconcile the MIMIT price feeds, wrote the region-selection logic that guarantees every region gets its turn on a fixed cycle, and generates this narrative fresh each day directly from that day's real figures.</w:t>
       </w:r>
     </w:p>
     <w:p>
@@ -4732,7 +4732,7 @@
           <w:sz w:val="22"/>
           <w:szCs w:val="22"/>
         </w:rPr>
-        <w:t xml:space="preserve">Contrast that with the traditional way this kind of tracking gets done: someone manually downloading a CSV each morning, pasting it into a spreadsheet, recalculating a handful of averages by hand, and writing up a summary if and when they get around to it. That approach doesn't scale past one or two fuels or one region, and it breaks the moment someone forgets a day. This pipeline runs the same way every single day, covers all four fuels and all 20 regions in rotation, and produces a full report plus a live dashboard update without anyone opening Excel.</w:t>
+        <w:t xml:space="preserve">Contrast that with the standard way this kind of tracking usually gets built: someone maintains a spreadsheet, manually pastes in new numbers, and writes up a summary if and when they have time — a process that decays the moment that person is busy, on leave, or moves on. This report and the live dashboard behind it are proof that the same job — ingesting messy public data, computing real trends, and communicating them clearly — can be handled end-to-end by an unattended, self-updating system, with a human only in the loop to review before anything gets shared publicly.</w:t>
       </w:r>
     </w:p>
     <w:p>
@@ -4769,7 +4769,7 @@
           <w:sz w:val="34"/>
           <w:szCs w:val="34"/>
         </w:rPr>
-        <w:t xml:space="preserve">Explore the Rest of Italy on the Live Dashboard</w:t>
+        <w:t xml:space="preserve">Explore Further on the Live Dashboard</w:t>
       </w:r>
     </w:p>
     <w:p>
@@ -4787,7 +4787,7 @@
           <w:sz w:val="22"/>
           <w:szCs w:val="22"/>
         </w:rPr>
-        <w:t xml:space="preserve">Trentino-Alto Adige is just today's spotlight — the Fuel Dashboard tracks all 20 Italian regions, every province, and thousands of individual comuni and stations, updated daily. Visit https://adeo-blip.github.io/fuel-price-italy/ to filter by your own region, compare fuels side by side, or see which part of Italy is paying the most (or least) right now.</w:t>
+        <w:t xml:space="preserve">The live Fuel Dashboard at https://adeo-blip.github.io/fuel-price-italy/ opens by default on Agip Eni's brand-level view, but that's just the starting point — use the scope picker to switch to Region, Province, Municipality, or any other Operator/Brand to dig into the numbers that matter most to you, whether that's your own province's diesel prices or how a specific chain compares to the market nationally.</w:t>
       </w:r>
     </w:p>
     <w:p>

</xml_diff>